<commit_message>
docs: 更新 CLAUDE.md + 新建 README + 操作指南新增 P2 章节
</commit_message>
<xml_diff>
--- a/docs/数据资产管理平台-测试版操作指南.docx
+++ b/docs/数据资产管理平台-测试版操作指南.docx
@@ -4927,6 +4927,368 @@
     <w:p>
       <w:r>
         <w:t>详细规则请参见平台内置文档：《金融数据分类分级规则手册》（docs/金融数据分类分级规则手册.md）。</w:t>
+      </w:r>
+    </w:p>
+    <w:p>
+      <w:pPr>
+        <w:pStyle w:val="1"/>
+      </w:pPr>
+      <w:r>
+        <w:t>十、合规清单导出与阈值管理（P2 新增功能）</w:t>
+      </w:r>
+    </w:p>
+    <w:p>
+      <w:pPr>
+        <w:pStyle w:val="21"/>
+      </w:pPr>
+      <w:r>
+        <w:t>10.1 功能概览</w:t>
+      </w:r>
+    </w:p>
+    <w:p>
+      <w:r>
+        <w:t>P2 阶段实现了两项《金融信息服务数据分类分级指南》要求的高级功能：（1）合规分类分级清单导出，符合指南 §6.4 标准格式；（2）30% 变化阈值检测与快照管理，满足指南动态更新管理要求。同时扩展了数据打标结果导出和映射管理优化。</w:t>
+      </w:r>
+    </w:p>
+    <w:p>
+      <w:pPr>
+        <w:pStyle w:val="21"/>
+      </w:pPr>
+      <w:r>
+        <w:t>10.2 合规清单导出（§6.4 标准格式）</w:t>
+      </w:r>
+    </w:p>
+    <w:p>
+      <w:r>
+        <w:t>入口：标准管理 → 执行分类 → 点击「导出合规清单」按钮。导出 Excel 包含两个 Sheet：</w:t>
+      </w:r>
+    </w:p>
+    <w:p>
+      <w:r>
+        <w:rPr>
+          <w:b/>
+        </w:rPr>
+        <w:t>「金融数据分类分级清单」Sheet</w:t>
+      </w:r>
+    </w:p>
+    <w:p>
+      <w:r>
+        <w:t>包含 18 列：序号、字段编码、字段名称、表名、数据库、一级分类、二级分类、三级分类、分类编码、数据描述、数据示例、参考最低级别、实际合规级别、级别是否升级、分级理由、业务域、数据来源、最后更新日期。仅导出已分类字段，按合规级别降序排列。</w:t>
+      </w:r>
+    </w:p>
+    <w:p>
+      <w:r>
+        <w:rPr>
+          <w:b/>
+        </w:rPr>
+        <w:t>「统计摘要」Sheet</w:t>
+      </w:r>
+    </w:p>
+    <w:p>
+      <w:r>
+        <w:t>展示导出时间、标准依据、活跃字段总数、已分类字段数、分类覆盖率、各级别分布（核心/重要/敏感一般/常规一般/未分类）。</w:t>
+      </w:r>
+    </w:p>
+    <w:p>
+      <w:pPr>
+        <w:pStyle w:val="21"/>
+      </w:pPr>
+      <w:r>
+        <w:t>10.3 30% 变化阈值检测</w:t>
+      </w:r>
+    </w:p>
+    <w:p>
+      <w:r>
+        <w:t>指南要求：核心数据和重要数据的条目数量或存储总量变化超过 30% 时，必须重新报送重要数据目录。平台实现了自动检测 + 快照管理：</w:t>
+      </w:r>
+    </w:p>
+    <w:p>
+      <w:pPr>
+        <w:pStyle w:val="a"/>
+      </w:pPr>
+      <w:r>
+        <w:t>进入标准管理 → 执行分类，页面顶部展示四个统计卡片：</w:t>
+      </w:r>
+    </w:p>
+    <w:p>
+      <w:pPr>
+        <w:pStyle w:val="a0"/>
+      </w:pPr>
+      <w:r>
+        <w:t>核心数据数量（红色）、重要数据数量（橙色）、关键数据合计（蓝色）、变化率（对比上次快照）</w:t>
+      </w:r>
+    </w:p>
+    <w:p>
+      <w:pPr>
+        <w:pStyle w:val="a"/>
+      </w:pPr>
+      <w:r>
+        <w:t>点击「创建阈值快照」按钮，记录当前核心/重要数据量作为基线</w:t>
+      </w:r>
+    </w:p>
+    <w:p>
+      <w:pPr>
+        <w:pStyle w:val="a"/>
+      </w:pPr>
+      <w:r>
+        <w:t>系统自动对比上次快照，变化超过 30% 时页面显示黄色警告条</w:t>
+      </w:r>
+    </w:p>
+    <w:p>
+      <w:pPr>
+        <w:pStyle w:val="a"/>
+      </w:pPr>
+      <w:r>
+        <w:t>页面下方「阈值快照历史」表格展示所有快照记录：时间、核心数、重要数、合计、上次合计、阈值触发状态</w:t>
+      </w:r>
+    </w:p>
+    <w:p>
+      <w:r>
+        <w:t>后端 API：GET /api/compliance/threshold 查询当前阈值状态；POST /api/compliance/threshold/snapshot 创建快照；GET /api/compliance/threshold/snapshots 查看快照历史。数据库表 important_data_snapshots 持久化所有快照。</w:t>
+      </w:r>
+    </w:p>
+    <w:p>
+      <w:pPr>
+        <w:pStyle w:val="21"/>
+      </w:pPr>
+      <w:r>
+        <w:t>10.4 数据打标结果导出</w:t>
+      </w:r>
+    </w:p>
+    <w:p>
+      <w:r>
+        <w:t>入口：数据打标 → 点击工具栏「导出结果」按钮。导出全部活跃字段的打标信息 Excel，包含：序号、字段编码、字段名称、英文名、数据类型、表名、数据库、业务域、金融合规分类（完整三级路径）、分类编码、合规数据级别、打标方法、置信度(%)、最后打标时间、是否异常、来源。附带统计摘要 Sheet（字段总数、覆盖率、级别分布、方法分布）。</w:t>
+      </w:r>
+    </w:p>
+    <w:p>
+      <w:pPr>
+        <w:pStyle w:val="21"/>
+      </w:pPr>
+      <w:r>
+        <w:t>10.5 映射管理优化</w:t>
+      </w:r>
+    </w:p>
+    <w:p>
+      <w:r>
+        <w:t>批量映射对话框和 AI 自动映射均进行了优化：目录选择器现在只显示叶子节点（没有子节点的最深级目录），确保映射始终落在资产目录的最下面一级。这避免了将字段错误映射到中间层级目录的问题。</w:t>
+      </w:r>
+    </w:p>
+    <w:p>
+      <w:pPr>
+        <w:pStyle w:val="1"/>
+      </w:pPr>
+      <w:r>
+        <w:t>十一、最新规则引擎更新（2026-06-15）</w:t>
+      </w:r>
+    </w:p>
+    <w:p>
+      <w:pPr>
+        <w:pStyle w:val="21"/>
+      </w:pPr>
+      <w:r>
+        <w:t>11.1 关键词库补全</w:t>
+      </w:r>
+    </w:p>
+    <w:p>
+      <w:r>
+        <w:t>合规引擎的精确关键词映射（第1层）新增以下高频金融术语，解决「理财产品」等新增字段显示"未分类"的问题：</w:t>
+      </w:r>
+    </w:p>
+    <w:tbl>
+      <w:tblPr>
+        <w:tblStyle w:val="-1"/>
+        <w:tblW w:type="auto" w:w="0"/>
+        <w:tblLook w:firstColumn="1" w:firstRow="1" w:lastColumn="0" w:lastRow="0" w:noHBand="0" w:noVBand="1" w:val="04A0"/>
+      </w:tblPr>
+      <w:tblGrid>
+        <w:gridCol w:w="4320"/>
+        <w:gridCol w:w="4320"/>
+      </w:tblGrid>
+      <w:tr>
+        <w:tc>
+          <w:tcPr>
+            <w:tcW w:type="dxa" w:w="4320"/>
+          </w:tcPr>
+          <w:p>
+            <w:r>
+              <w:t>关键词</w:t>
+            </w:r>
+          </w:p>
+        </w:tc>
+        <w:tc>
+          <w:tcPr>
+            <w:tcW w:type="dxa" w:w="4320"/>
+          </w:tcPr>
+          <w:p>
+            <w:r>
+              <w:t>映射分类</w:t>
+            </w:r>
+          </w:p>
+        </w:tc>
+      </w:tr>
+      <w:tr>
+        <w:tc>
+          <w:tcPr>
+            <w:tcW w:type="dxa" w:w="4320"/>
+          </w:tcPr>
+          <w:p>
+            <w:r>
+              <w:t>理财</w:t>
+            </w:r>
+          </w:p>
+        </w:tc>
+        <w:tc>
+          <w:tcPr>
+            <w:tcW w:type="dxa" w:w="4320"/>
+          </w:tcPr>
+          <w:p>
+            <w:r>
+              <w:t>FIN_BIZ_MKT_FUND（基金数据）</w:t>
+            </w:r>
+          </w:p>
+        </w:tc>
+      </w:tr>
+      <w:tr>
+        <w:tc>
+          <w:tcPr>
+            <w:tcW w:type="dxa" w:w="4320"/>
+          </w:tcPr>
+          <w:p>
+            <w:r>
+              <w:t>信托</w:t>
+            </w:r>
+          </w:p>
+        </w:tc>
+        <w:tc>
+          <w:tcPr>
+            <w:tcW w:type="dxa" w:w="4320"/>
+          </w:tcPr>
+          <w:p>
+            <w:r>
+              <w:t>FIN_BIZ_MKT_FUND_PRIVATE（私募基金数据）</w:t>
+            </w:r>
+          </w:p>
+        </w:tc>
+      </w:tr>
+      <w:tr>
+        <w:tc>
+          <w:tcPr>
+            <w:tcW w:type="dxa" w:w="4320"/>
+          </w:tcPr>
+          <w:p>
+            <w:r>
+              <w:t>保险</w:t>
+            </w:r>
+          </w:p>
+        </w:tc>
+        <w:tc>
+          <w:tcPr>
+            <w:tcW w:type="dxa" w:w="4320"/>
+          </w:tcPr>
+          <w:p>
+            <w:r>
+              <w:t>FIN_BIZ_MKT_ABS（资产证券化数据）</w:t>
+            </w:r>
+          </w:p>
+        </w:tc>
+      </w:tr>
+      <w:tr>
+        <w:tc>
+          <w:tcPr>
+            <w:tcW w:type="dxa" w:w="4320"/>
+          </w:tcPr>
+          <w:p>
+            <w:r>
+              <w:t>黄金</w:t>
+            </w:r>
+          </w:p>
+        </w:tc>
+        <w:tc>
+          <w:tcPr>
+            <w:tcW w:type="dxa" w:w="4320"/>
+          </w:tcPr>
+          <w:p>
+            <w:r>
+              <w:t>FIN_BIZ_MKT_COMM（商品数据）</w:t>
+            </w:r>
+          </w:p>
+        </w:tc>
+      </w:tr>
+      <w:tr>
+        <w:tc>
+          <w:tcPr>
+            <w:tcW w:type="dxa" w:w="4320"/>
+          </w:tcPr>
+          <w:p>
+            <w:r>
+              <w:t>外汇</w:t>
+            </w:r>
+          </w:p>
+        </w:tc>
+        <w:tc>
+          <w:tcPr>
+            <w:tcW w:type="dxa" w:w="4320"/>
+          </w:tcPr>
+          <w:p>
+            <w:r>
+              <w:t>FIN_BIZ_MKT_FX（外汇数据）</w:t>
+            </w:r>
+          </w:p>
+        </w:tc>
+      </w:tr>
+      <w:tr>
+        <w:tc>
+          <w:tcPr>
+            <w:tcW w:type="dxa" w:w="4320"/>
+          </w:tcPr>
+          <w:p>
+            <w:r>
+              <w:t>汇率</w:t>
+            </w:r>
+          </w:p>
+        </w:tc>
+        <w:tc>
+          <w:tcPr>
+            <w:tcW w:type="dxa" w:w="4320"/>
+          </w:tcPr>
+          <w:p>
+            <w:r>
+              <w:t>FIN_BIZ_MKT_FX（外汇数据）</w:t>
+            </w:r>
+          </w:p>
+        </w:tc>
+      </w:tr>
+    </w:tbl>
+    <w:p/>
+    <w:p>
+      <w:r>
+        <w:t>同时在产品信号层（第2层）和兜底推断层（第4层）同步更新，确保多路径覆盖。新增字段创建时自动触发合规分类，无需手动重新执行。</w:t>
+      </w:r>
+    </w:p>
+    <w:p>
+      <w:pPr>
+        <w:pStyle w:val="21"/>
+      </w:pPr>
+      <w:r>
+        <w:t>11.2 置信度计算优化</w:t>
+      </w:r>
+    </w:p>
+    <w:p>
+      <w:r>
+        <w:t>置信度从原来的固定 70% 升级为动态计算，基于匹配质量：基础 60% + 分类命中 10% + 匹配层奖励（精确关键词 20% / 产品信号 15% / 业务域 10%）+ 影响对象信号 5% + 矩阵升级 5% + 就高从严升级 5%。上限 99%，确保"高置信度 = 高质量匹配"。</w:t>
+      </w:r>
+    </w:p>
+    <w:p>
+      <w:pPr>
+        <w:pStyle w:val="21"/>
+      </w:pPr>
+      <w:r>
+        <w:t>11.3 三级分类路径展示</w:t>
+      </w:r>
+    </w:p>
+    <w:p>
+      <w:r>
+        <w:t>字段管理、数据打标、导出清单中，「金融合规分类」列现在展示完整三级路径（如「业务数据 &gt; 金融市场数据 &gt; 基金数据」），而非仅显示三级分类名称。路径通过遍历 parent_id 链自动构建，清晰展示数据在分类体系中的位置。</w:t>
       </w:r>
     </w:p>
     <w:sectPr>

</xml_diff>